<commit_message>
Fix _templatesDirectory et _outputDirectory chemins relatifs → AppDomain. Suppression debug AD1/AD2/AD3. LoadJsonData verbeux → identité directe sans XLSX.
</commit_message>
<xml_diff>
--- a/templates/CCEOM_template_univ.docx
+++ b/templates/CCEOM_template_univ.docx
@@ -4379,7 +4379,8 @@
       <w:pPr>
         <w:keepNext/>
         <w:spacing w:after="4" w:line="256" w:lineRule="auto"/>
-        <w:ind w:right="14"/>
+        <w:ind w:left="284" w:right="14"/>
+        <w:jc w:val="both"/>
         <w:rPr>
           <w:rFonts w:ascii="Times New Roman" w:eastAsia="Cambria" w:hAnsi="Times New Roman" w:cs="Times New Roman"/>
           <w:color w:val="FF0000"/>
@@ -4388,35 +4389,37 @@
       </w:pPr>
       <w:r>
         <w:rPr>
-          <w:rFonts w:ascii="Times New Roman" w:eastAsia="Cambria" w:hAnsi="Times New Roman" w:cs="Times New Roman"/>
-          <w:color w:val="FF0000"/>
-          <w:sz w:val="18"/>
-        </w:rPr>
-        <w:t xml:space="preserve">       </w:t>
-      </w:r>
-      <w:r>
-        <w:rPr>
           <w:rFonts w:ascii="Cambria" w:eastAsia="Cambria" w:hAnsi="Cambria" w:cs="Cambria"/>
           <w:color w:val="EE0000"/>
-          <w:sz w:val="18"/>
-        </w:rPr>
-        <w:t>{Mention_Article11_NonSACEM}</w:t>
-      </w:r>
-    </w:p>
-    <w:p>
-      <w:pPr>
-        <w:keepNext/>
-        <w:spacing w:after="325"/>
-        <w:ind w:left="2"/>
-      </w:pPr>
-      <w:r>
-        <w:rPr>
-          <w:rFonts w:ascii="Cambria" w:eastAsia="Cambria" w:hAnsi="Cambria" w:cs="Cambria"/>
-          <w:b/>
-          <w:sz w:val="18"/>
-        </w:rPr>
-        <w:t xml:space="preserve"> </w:t>
-      </w:r>
+        </w:rPr>
+        <w:t>{MENTION_NONSACEM}</w:t>
+      </w:r>
+    </w:p>
+    <w:p>
+      <w:pPr>
+        <w:spacing w:after="3"/>
+        <w:ind w:left="284" w:right="27"/>
+        <w:rPr>
+          <w:rFonts w:ascii="Cambria" w:eastAsia="Cambria" w:hAnsi="Cambria" w:cs="Cambria"/>
+          <w:color w:val="EE0000"/>
+        </w:rPr>
+      </w:pPr>
+      <w:r>
+        <w:rPr>
+          <w:rFonts w:ascii="Cambria" w:eastAsia="Cambria" w:hAnsi="Cambria" w:cs="Cambria"/>
+          <w:color w:val="EE0000"/>
+        </w:rPr>
+        <w:t>{LIST_NONSACEM}</w:t>
+      </w:r>
+    </w:p>
+    <w:p>
+      <w:pPr>
+        <w:spacing w:after="3"/>
+        <w:ind w:left="284" w:right="27"/>
+        <w:rPr>
+          <w:color w:val="EE0000"/>
+        </w:rPr>
+      </w:pPr>
     </w:p>
     <w:p>
       <w:pPr>
@@ -4922,15 +4925,45 @@
     </w:p>
     <w:p>
       <w:pPr>
-        <w:spacing w:after="3" w:line="256" w:lineRule="auto"/>
-        <w:ind w:left="292" w:right="14"/>
-        <w:jc w:val="both"/>
-      </w:pPr>
-    </w:p>
-    <w:p>
-      <w:pPr>
-        <w:spacing w:after="325"/>
-        <w:ind w:left="2"/>
+        <w:keepNext/>
+        <w:spacing w:after="4" w:line="256" w:lineRule="auto"/>
+        <w:ind w:left="284" w:right="14"/>
+        <w:jc w:val="both"/>
+        <w:rPr>
+          <w:rFonts w:ascii="Times New Roman" w:eastAsia="Cambria" w:hAnsi="Times New Roman" w:cs="Times New Roman"/>
+          <w:color w:val="FF0000"/>
+          <w:sz w:val="18"/>
+        </w:rPr>
+      </w:pPr>
+      <w:r>
+        <w:rPr>
+          <w:rFonts w:ascii="Cambria" w:eastAsia="Cambria" w:hAnsi="Cambria" w:cs="Cambria"/>
+          <w:color w:val="EE0000"/>
+        </w:rPr>
+        <w:t>{MENTION_NONSACEM}</w:t>
+      </w:r>
+    </w:p>
+    <w:p>
+      <w:pPr>
+        <w:spacing w:after="3"/>
+        <w:ind w:left="284" w:right="27"/>
+        <w:rPr>
+          <w:rFonts w:ascii="Cambria" w:eastAsia="Cambria" w:hAnsi="Cambria" w:cs="Cambria"/>
+          <w:color w:val="EE0000"/>
+        </w:rPr>
+      </w:pPr>
+      <w:r>
+        <w:rPr>
+          <w:rFonts w:ascii="Cambria" w:eastAsia="Cambria" w:hAnsi="Cambria" w:cs="Cambria"/>
+          <w:color w:val="EE0000"/>
+        </w:rPr>
+        <w:t>{LIST_NONSACEM}</w:t>
+      </w:r>
+    </w:p>
+    <w:p>
+      <w:pPr>
+        <w:spacing w:after="3"/>
+        <w:ind w:left="284" w:right="27"/>
       </w:pPr>
     </w:p>
     <w:p>
@@ -6321,6 +6354,18 @@
     <w:p>
       <w:pPr>
         <w:pStyle w:val="Paragraphedeliste"/>
+        <w:spacing w:after="16" w:line="256" w:lineRule="auto"/>
+        <w:ind w:left="0" w:right="15"/>
+        <w:jc w:val="both"/>
+        <w:rPr>
+          <w:rFonts w:ascii="Cambria" w:eastAsia="Cambria" w:hAnsi="Cambria" w:cs="Cambria"/>
+          <w:sz w:val="18"/>
+        </w:rPr>
+      </w:pPr>
+    </w:p>
+    <w:p>
+      <w:pPr>
+        <w:pStyle w:val="Paragraphedeliste"/>
         <w:numPr>
           <w:ilvl w:val="0"/>
           <w:numId w:val="5"/>
@@ -6507,22 +6552,39 @@
     </w:p>
     <w:p>
       <w:pPr>
-        <w:spacing w:after="16" w:line="256" w:lineRule="auto"/>
-        <w:ind w:right="15"/>
-        <w:jc w:val="both"/>
+        <w:keepNext/>
+        <w:spacing w:after="4" w:line="256" w:lineRule="auto"/>
+        <w:ind w:left="284" w:right="14"/>
+        <w:jc w:val="both"/>
+        <w:rPr>
+          <w:rFonts w:ascii="Times New Roman" w:eastAsia="Cambria" w:hAnsi="Times New Roman" w:cs="Times New Roman"/>
+          <w:color w:val="FF0000"/>
+          <w:sz w:val="18"/>
+        </w:rPr>
+      </w:pPr>
+      <w:r>
         <w:rPr>
           <w:rFonts w:ascii="Cambria" w:eastAsia="Cambria" w:hAnsi="Cambria" w:cs="Cambria"/>
           <w:color w:val="EE0000"/>
-          <w:sz w:val="18"/>
-        </w:rPr>
-      </w:pPr>
-      <w:r>
+        </w:rPr>
+        <w:t>{MENTION_NONSACEM}</w:t>
+      </w:r>
+    </w:p>
+    <w:p>
+      <w:pPr>
+        <w:spacing w:after="3"/>
+        <w:ind w:left="284" w:right="27"/>
         <w:rPr>
           <w:rFonts w:ascii="Cambria" w:eastAsia="Cambria" w:hAnsi="Cambria" w:cs="Cambria"/>
           <w:color w:val="EE0000"/>
-          <w:sz w:val="18"/>
-        </w:rPr>
-        <w:t>{Mention_Article16_NonSACEM}</w:t>
+        </w:rPr>
+      </w:pPr>
+      <w:r>
+        <w:rPr>
+          <w:rFonts w:ascii="Cambria" w:eastAsia="Cambria" w:hAnsi="Cambria" w:cs="Cambria"/>
+          <w:color w:val="EE0000"/>
+        </w:rPr>
+        <w:t>{LIST_NONSACEM}</w:t>
       </w:r>
     </w:p>
     <w:p>
@@ -8947,7 +9009,7 @@
   <w:style w:type="paragraph" w:default="1" w:styleId="Normal">
     <w:name w:val="Normal"/>
     <w:qFormat/>
-    <w:rsid w:val="0046769C"/>
+    <w:rsid w:val="00A33396"/>
     <w:rPr>
       <w:rFonts w:ascii="Calibri" w:eastAsia="Calibri" w:hAnsi="Calibri" w:cs="Calibri"/>
       <w:color w:val="000000"/>
@@ -8999,6 +9061,7 @@
   <w:style w:type="character" w:default="1" w:styleId="Policepardfaut">
     <w:name w:val="Default Paragraph Font"/>
     <w:uiPriority w:val="1"/>
+    <w:semiHidden/>
     <w:unhideWhenUsed/>
   </w:style>
   <w:style w:type="table" w:default="1" w:styleId="TableauNormal">

</xml_diff>